<commit_message>
Add PDF docs and clarify README seed note
</commit_message>
<xml_diff>
--- a/Documentation/technical_documentation.docx
+++ b/Documentation/technical_documentation.docx
@@ -115,8 +115,16 @@
         <w:rPr>
           <w:rFonts w:ascii="Bariol" w:hAnsi="Bariol"/>
         </w:rPr>
-        <w:t>Data Engineering</w:t>
-      </w:r>
+        <w:t xml:space="preserve">Data </w:t>
+      </w:r>
+      <w:proofErr w:type="spellStart"/>
+      <w:r>
+        <w:rPr>
+          <w:rFonts w:ascii="Bariol" w:hAnsi="Bariol"/>
+        </w:rPr>
+        <w:t>Engineering</w:t>
+      </w:r>
+      <w:proofErr w:type="spellEnd"/>
     </w:p>
     <w:p>
       <w:pPr>
@@ -170,6 +178,7 @@
           <w:szCs w:val="72"/>
         </w:rPr>
       </w:pPr>
+      <w:proofErr w:type="spellStart"/>
       <w:r>
         <w:rPr>
           <w:rStyle w:val="Kiemels2"/>
@@ -177,7 +186,17 @@
           <w:sz w:val="72"/>
           <w:szCs w:val="72"/>
         </w:rPr>
-        <w:t>Kriptovaluta és részvény adatok elemzése</w:t>
+        <w:t>Kriptovaluta</w:t>
+      </w:r>
+      <w:proofErr w:type="spellEnd"/>
+      <w:r>
+        <w:rPr>
+          <w:rStyle w:val="Kiemels2"/>
+          <w:rFonts w:ascii="Bariol" w:hAnsi="Bariol"/>
+          <w:sz w:val="72"/>
+          <w:szCs w:val="72"/>
+        </w:rPr>
+        <w:t xml:space="preserve"> és részvény adatok elemzése</w:t>
       </w:r>
     </w:p>
     <w:p>
@@ -376,7 +395,23 @@
     </w:p>
     <w:p>
       <w:r>
-        <w:t>A rendszer egy modern, Medallion Architecture alapú felépítést követ, amely három f</w:t>
+        <w:t xml:space="preserve">A rendszer egy modern, </w:t>
+      </w:r>
+      <w:proofErr w:type="spellStart"/>
+      <w:r>
+        <w:t>Medallion</w:t>
+      </w:r>
+      <w:proofErr w:type="spellEnd"/>
+      <w:r>
+        <w:t xml:space="preserve"> </w:t>
+      </w:r>
+      <w:proofErr w:type="spellStart"/>
+      <w:r>
+        <w:t>Architecture</w:t>
+      </w:r>
+      <w:proofErr w:type="spellEnd"/>
+      <w:r>
+        <w:t xml:space="preserve"> alapú felépítést követ, amely három f</w:t>
       </w:r>
       <w:r>
         <w:rPr>
@@ -385,7 +420,39 @@
         <w:t>ő</w:t>
       </w:r>
       <w:r>
-        <w:t xml:space="preserve"> rétegre (Bronze, Silver, Gold) tagolódik. Az architektúra központi eleme az ELT (Extract-Load-Transform) szemlélet, amely biztosítja az adatok sértetlenségét és a pipeline újrafuttathatóságát.</w:t>
+        <w:t xml:space="preserve"> rétegre (</w:t>
+      </w:r>
+      <w:proofErr w:type="spellStart"/>
+      <w:r>
+        <w:t>Bronze</w:t>
+      </w:r>
+      <w:proofErr w:type="spellEnd"/>
+      <w:r>
+        <w:t>, Silver, Gold) tagolódik. Az architektúra központi eleme az ELT (</w:t>
+      </w:r>
+      <w:proofErr w:type="spellStart"/>
+      <w:r>
+        <w:t>Extract-Load-Transform</w:t>
+      </w:r>
+      <w:proofErr w:type="spellEnd"/>
+      <w:r>
+        <w:t xml:space="preserve">) szemlélet, amely biztosítja az adatok sértetlenségét és a </w:t>
+      </w:r>
+      <w:proofErr w:type="spellStart"/>
+      <w:r>
+        <w:t>pipeline</w:t>
+      </w:r>
+      <w:proofErr w:type="spellEnd"/>
+      <w:r>
+        <w:t xml:space="preserve"> </w:t>
+      </w:r>
+      <w:proofErr w:type="spellStart"/>
+      <w:r>
+        <w:t>újrafuttathatóságát</w:t>
+      </w:r>
+      <w:proofErr w:type="spellEnd"/>
+      <w:r>
+        <w:t>.</w:t>
       </w:r>
     </w:p>
     <w:p>
@@ -407,14 +474,40 @@
           <w:numId w:val="12"/>
         </w:numPr>
       </w:pPr>
-      <w:r>
-        <w:t>Bronze (Landing Zone</w:t>
-      </w:r>
+      <w:proofErr w:type="spellStart"/>
+      <w:r>
+        <w:t>Bronze</w:t>
+      </w:r>
+      <w:proofErr w:type="spellEnd"/>
+      <w:r>
+        <w:t xml:space="preserve"> (</w:t>
+      </w:r>
+      <w:proofErr w:type="spellStart"/>
+      <w:r>
+        <w:t>Landing</w:t>
+      </w:r>
+      <w:proofErr w:type="spellEnd"/>
+      <w:r>
+        <w:t xml:space="preserve"> </w:t>
+      </w:r>
+      <w:proofErr w:type="spellStart"/>
+      <w:r>
+        <w:t>Zone</w:t>
+      </w:r>
+      <w:proofErr w:type="spellEnd"/>
       <w:r>
         <w:t>:</w:t>
       </w:r>
       <w:r>
-        <w:t xml:space="preserve"> MinIO): A nyers adatok (JSON/CSV) változtatás nélkül tárol</w:t>
+        <w:t xml:space="preserve"> </w:t>
+      </w:r>
+      <w:proofErr w:type="spellStart"/>
+      <w:r>
+        <w:t>MinIO</w:t>
+      </w:r>
+      <w:proofErr w:type="spellEnd"/>
+      <w:r>
+        <w:t>): A nyers adatok (JSON/CSV) változtatás nélkül tárol</w:t>
       </w:r>
       <w:r>
         <w:t>ódnak</w:t>
@@ -465,7 +558,15 @@
         <w:t>:</w:t>
       </w:r>
       <w:r>
-        <w:t xml:space="preserve"> PostgreSQL): Itt található a tisztított, strukturált adattárház, amely egy optimalizált csillag sémára épül.</w:t>
+        <w:t xml:space="preserve"> </w:t>
+      </w:r>
+      <w:proofErr w:type="spellStart"/>
+      <w:r>
+        <w:t>PostgreSQL</w:t>
+      </w:r>
+      <w:proofErr w:type="spellEnd"/>
+      <w:r>
+        <w:t>): Itt található a tisztított, strukturált adattárház, amely egy optimalizált csillag sémára épül.</w:t>
       </w:r>
     </w:p>
     <w:p>
@@ -477,19 +578,45 @@
         </w:numPr>
       </w:pPr>
       <w:r>
-        <w:t>Gold (Serving</w:t>
-      </w:r>
+        <w:t>Gold (</w:t>
+      </w:r>
+      <w:proofErr w:type="spellStart"/>
+      <w:r>
+        <w:t>Serving</w:t>
+      </w:r>
+      <w:proofErr w:type="spellEnd"/>
       <w:r>
         <w:t xml:space="preserve">: </w:t>
       </w:r>
-      <w:r>
-        <w:t xml:space="preserve">Redis </w:t>
+      <w:proofErr w:type="spellStart"/>
+      <w:r>
+        <w:t>Redis</w:t>
+      </w:r>
+      <w:proofErr w:type="spellEnd"/>
+      <w:r>
+        <w:t xml:space="preserve"> </w:t>
       </w:r>
       <w:r>
         <w:t>és</w:t>
       </w:r>
       <w:r>
-        <w:t xml:space="preserve"> Materialized View): Az aggregált, nagy sebesség</w:t>
+        <w:t xml:space="preserve"> </w:t>
+      </w:r>
+      <w:proofErr w:type="spellStart"/>
+      <w:r>
+        <w:t>Materialized</w:t>
+      </w:r>
+      <w:proofErr w:type="spellEnd"/>
+      <w:r>
+        <w:t xml:space="preserve"> </w:t>
+      </w:r>
+      <w:proofErr w:type="spellStart"/>
+      <w:r>
+        <w:t>View</w:t>
+      </w:r>
+      <w:proofErr w:type="spellEnd"/>
+      <w:r>
+        <w:t>): Az aggregált, nagy sebesség</w:t>
       </w:r>
       <w:r>
         <w:rPr>
@@ -513,7 +640,31 @@
         <w:t>van</w:t>
       </w:r>
       <w:r>
-        <w:t xml:space="preserve">  a Materialized View a napi záróárakhoz, valamint a Redis cache a valós idej</w:t>
+        <w:t xml:space="preserve">  a </w:t>
+      </w:r>
+      <w:proofErr w:type="spellStart"/>
+      <w:r>
+        <w:t>Materialized</w:t>
+      </w:r>
+      <w:proofErr w:type="spellEnd"/>
+      <w:r>
+        <w:t xml:space="preserve"> </w:t>
+      </w:r>
+      <w:proofErr w:type="spellStart"/>
+      <w:r>
+        <w:t>View</w:t>
+      </w:r>
+      <w:proofErr w:type="spellEnd"/>
+      <w:r>
+        <w:t xml:space="preserve"> a napi záróárakhoz, valamint a </w:t>
+      </w:r>
+      <w:proofErr w:type="spellStart"/>
+      <w:r>
+        <w:t>Redis</w:t>
+      </w:r>
+      <w:proofErr w:type="spellEnd"/>
+      <w:r>
+        <w:t xml:space="preserve"> cache a valós idej</w:t>
       </w:r>
       <w:r>
         <w:rPr>
@@ -544,8 +695,29 @@
           <w:numId w:val="13"/>
         </w:numPr>
       </w:pPr>
-      <w:r>
-        <w:t>Prefect (Orkesztráció): A Prefect modern Python megközelítést ad, jobb hibat</w:t>
+      <w:proofErr w:type="spellStart"/>
+      <w:r>
+        <w:t>Prefect</w:t>
+      </w:r>
+      <w:proofErr w:type="spellEnd"/>
+      <w:r>
+        <w:t xml:space="preserve"> (</w:t>
+      </w:r>
+      <w:proofErr w:type="spellStart"/>
+      <w:r>
+        <w:t>Orkesztráció</w:t>
+      </w:r>
+      <w:proofErr w:type="spellEnd"/>
+      <w:r>
+        <w:t xml:space="preserve">): A </w:t>
+      </w:r>
+      <w:proofErr w:type="spellStart"/>
+      <w:r>
+        <w:t>Prefect</w:t>
+      </w:r>
+      <w:proofErr w:type="spellEnd"/>
+      <w:r>
+        <w:t xml:space="preserve"> modern Python megközelítést ad, jobb hibat</w:t>
       </w:r>
       <w:r>
         <w:rPr>
@@ -554,13 +726,26 @@
         <w:t>ű</w:t>
       </w:r>
       <w:r>
-        <w:t>réssel (Retry logika) és részletesebb monitorozási felülettel</w:t>
+        <w:t>réssel (</w:t>
+      </w:r>
+      <w:proofErr w:type="spellStart"/>
+      <w:r>
+        <w:t>Retry</w:t>
+      </w:r>
+      <w:proofErr w:type="spellEnd"/>
+      <w:r>
+        <w:t xml:space="preserve"> logika) és részletesebb monitorozási felülettel</w:t>
       </w:r>
       <w:r>
         <w:t xml:space="preserve"> (</w:t>
       </w:r>
-      <w:r>
-        <w:t>Prefect UI</w:t>
+      <w:proofErr w:type="spellStart"/>
+      <w:r>
+        <w:t>Prefect</w:t>
+      </w:r>
+      <w:proofErr w:type="spellEnd"/>
+      <w:r>
+        <w:t xml:space="preserve"> UI</w:t>
       </w:r>
       <w:r>
         <w:t>)</w:t>
@@ -577,8 +762,21 @@
           <w:numId w:val="13"/>
         </w:numPr>
       </w:pPr>
-      <w:r>
-        <w:t xml:space="preserve">Redis + FastAPI: Mivel a pénzügyi adatok </w:t>
+      <w:proofErr w:type="spellStart"/>
+      <w:r>
+        <w:t>Redis</w:t>
+      </w:r>
+      <w:proofErr w:type="spellEnd"/>
+      <w:r>
+        <w:t xml:space="preserve"> + </w:t>
+      </w:r>
+      <w:proofErr w:type="spellStart"/>
+      <w:r>
+        <w:t>FastAPI</w:t>
+      </w:r>
+      <w:proofErr w:type="spellEnd"/>
+      <w:r>
+        <w:t xml:space="preserve">: Mivel a pénzügyi adatok </w:t>
       </w:r>
       <w:r>
         <w:t>gyakran frissülnek</w:t>
@@ -593,10 +791,26 @@
         <w:t>frissességet</w:t>
       </w:r>
       <w:r>
-        <w:t xml:space="preserve"> garantálja a CoinPaprika, az a szűk keresztmetszet</w:t>
-      </w:r>
-      <w:r>
-        <w:t>), a Grafana közvetlen adatbázis</w:t>
+        <w:t xml:space="preserve"> garantálja a </w:t>
+      </w:r>
+      <w:proofErr w:type="spellStart"/>
+      <w:r>
+        <w:t>CoinPaprika</w:t>
+      </w:r>
+      <w:proofErr w:type="spellEnd"/>
+      <w:r>
+        <w:t>, az a szűk keresztmetszet</w:t>
+      </w:r>
+      <w:r>
+        <w:t xml:space="preserve">), a </w:t>
+      </w:r>
+      <w:proofErr w:type="spellStart"/>
+      <w:r>
+        <w:t>Grafana</w:t>
+      </w:r>
+      <w:proofErr w:type="spellEnd"/>
+      <w:r>
+        <w:t xml:space="preserve"> közvetlen adatbázis</w:t>
       </w:r>
       <w:r>
         <w:t xml:space="preserve"> </w:t>
@@ -614,11 +828,48 @@
         <w:t xml:space="preserve"> használ a rendszer</w:t>
       </w:r>
       <w:r>
-        <w:t>. A FastAPI egységes interfészt biztosít, így a Grafana Infinity pluginja konzisztens J</w:t>
+        <w:t xml:space="preserve">. A </w:t>
+      </w:r>
+      <w:proofErr w:type="spellStart"/>
+      <w:r>
+        <w:t>FastAPI</w:t>
+      </w:r>
+      <w:proofErr w:type="spellEnd"/>
+      <w:r>
+        <w:t xml:space="preserve"> egységes interfészt biztosít, így a </w:t>
+      </w:r>
+      <w:proofErr w:type="spellStart"/>
+      <w:r>
+        <w:t>Grafana</w:t>
+      </w:r>
+      <w:proofErr w:type="spellEnd"/>
+      <w:r>
+        <w:t xml:space="preserve"> </w:t>
+      </w:r>
+      <w:proofErr w:type="spellStart"/>
+      <w:r>
+        <w:t>Infinity</w:t>
+      </w:r>
+      <w:proofErr w:type="spellEnd"/>
+      <w:r>
+        <w:t xml:space="preserve"> </w:t>
+      </w:r>
+      <w:proofErr w:type="spellStart"/>
+      <w:r>
+        <w:t>pluginja</w:t>
+      </w:r>
+      <w:proofErr w:type="spellEnd"/>
+      <w:r>
+        <w:t xml:space="preserve"> konzisztens </w:t>
+      </w:r>
+      <w:proofErr w:type="spellStart"/>
+      <w:r>
+        <w:t>J</w:t>
       </w:r>
       <w:r>
         <w:t>son</w:t>
       </w:r>
+      <w:proofErr w:type="spellEnd"/>
       <w:r>
         <w:t xml:space="preserve"> válaszokat kap</w:t>
       </w:r>
@@ -631,8 +882,53 @@
           <w:numId w:val="13"/>
         </w:numPr>
       </w:pPr>
-      <w:r>
-        <w:t>PostgreSQL Materialized View: A több millió intraday rekord feletti aggregáció (napi záróár keresés) számításigényes. A nézet fizikai tárolása (materializálása) radikálisan csökkenti a dashboardok betöltési idejét</w:t>
+      <w:proofErr w:type="spellStart"/>
+      <w:r>
+        <w:t>PostgreSQL</w:t>
+      </w:r>
+      <w:proofErr w:type="spellEnd"/>
+      <w:r>
+        <w:t xml:space="preserve"> </w:t>
+      </w:r>
+      <w:proofErr w:type="spellStart"/>
+      <w:r>
+        <w:t>Materialized</w:t>
+      </w:r>
+      <w:proofErr w:type="spellEnd"/>
+      <w:r>
+        <w:t xml:space="preserve"> </w:t>
+      </w:r>
+      <w:proofErr w:type="spellStart"/>
+      <w:r>
+        <w:t>View</w:t>
+      </w:r>
+      <w:proofErr w:type="spellEnd"/>
+      <w:r>
+        <w:t xml:space="preserve">: A több millió </w:t>
+      </w:r>
+      <w:proofErr w:type="spellStart"/>
+      <w:r>
+        <w:t>intraday</w:t>
+      </w:r>
+      <w:proofErr w:type="spellEnd"/>
+      <w:r>
+        <w:t xml:space="preserve"> rekord feletti </w:t>
+      </w:r>
+      <w:proofErr w:type="spellStart"/>
+      <w:r>
+        <w:t>aggregáció</w:t>
+      </w:r>
+      <w:proofErr w:type="spellEnd"/>
+      <w:r>
+        <w:t xml:space="preserve"> (napi záróár keresés) számításigényes. A nézet fizikai tárolása (materializálása) radikálisan csökkenti a </w:t>
+      </w:r>
+      <w:proofErr w:type="spellStart"/>
+      <w:r>
+        <w:t>dashboardok</w:t>
+      </w:r>
+      <w:proofErr w:type="spellEnd"/>
+      <w:r>
+        <w:t xml:space="preserve"> betöltési idejét</w:t>
       </w:r>
       <w:r>
         <w:t xml:space="preserve"> sok adat esetén.</w:t>
@@ -670,8 +966,13 @@
           <w:numId w:val="14"/>
         </w:numPr>
       </w:pPr>
-      <w:r>
-        <w:t>dwh.intraday_price_fact (Ténytábla): Tartalmazza a mért értékeket: aktuális ár, forgalom, volumen USD</w:t>
+      <w:proofErr w:type="spellStart"/>
+      <w:r>
+        <w:t>dwh.intraday_price_fact</w:t>
+      </w:r>
+      <w:proofErr w:type="spellEnd"/>
+      <w:r>
+        <w:t xml:space="preserve"> (Ténytábla): Tartalmazza a mért értékeket: aktuális ár, forgalom, volumen USD</w:t>
       </w:r>
       <w:r>
         <w:t>-</w:t>
@@ -688,8 +989,29 @@
           <w:numId w:val="14"/>
         </w:numPr>
       </w:pPr>
-      <w:r>
-        <w:t>dwh.asset_dim (Dimenziótábla): Tárolja az eszközök leíró adatait (szimbólum, teljes név, eszközosztály: stock/crypto)</w:t>
+      <w:proofErr w:type="spellStart"/>
+      <w:r>
+        <w:t>dwh.asset_dim</w:t>
+      </w:r>
+      <w:proofErr w:type="spellEnd"/>
+      <w:r>
+        <w:t xml:space="preserve"> (Dimenziótábla): Tárolja az eszközök leíró adatait (szimbólum, teljes név, eszközosztály: </w:t>
+      </w:r>
+      <w:proofErr w:type="spellStart"/>
+      <w:r>
+        <w:t>stock</w:t>
+      </w:r>
+      <w:proofErr w:type="spellEnd"/>
+      <w:r>
+        <w:t>/</w:t>
+      </w:r>
+      <w:proofErr w:type="spellStart"/>
+      <w:r>
+        <w:t>crypto</w:t>
+      </w:r>
+      <w:proofErr w:type="spellEnd"/>
+      <w:r>
+        <w:t>)</w:t>
       </w:r>
     </w:p>
     <w:p>
@@ -700,8 +1022,13 @@
           <w:numId w:val="14"/>
         </w:numPr>
       </w:pPr>
-      <w:r>
-        <w:t>dwh.date_dim (Dimenziótábla): Egy speciális id</w:t>
+      <w:proofErr w:type="spellStart"/>
+      <w:r>
+        <w:t>dwh.date_dim</w:t>
+      </w:r>
+      <w:proofErr w:type="spellEnd"/>
+      <w:r>
+        <w:t xml:space="preserve"> (Dimenziótábla): Egy speciális id</w:t>
       </w:r>
       <w:r>
         <w:rPr>
@@ -815,8 +1142,45 @@
           <w:numId w:val="15"/>
         </w:numPr>
       </w:pPr>
-      <w:r>
-        <w:t>Idempotencia: A betöltési folyamatok úgy lettek tervezve, hogy egyedi kulcsok (asset_id + snapshot_ts) alapján dolgozzanak. Így egy hálózati hiba utáni újrafuttatás nem okoz duplikációt.</w:t>
+      <w:proofErr w:type="spellStart"/>
+      <w:r>
+        <w:t>Idempotencia</w:t>
+      </w:r>
+      <w:proofErr w:type="spellEnd"/>
+      <w:r>
+        <w:t>: A betöltési folyamatok úgy lettek tervezve, hogy egyedi kulcsok (</w:t>
+      </w:r>
+      <w:proofErr w:type="spellStart"/>
+      <w:r>
+        <w:t>asset_id</w:t>
+      </w:r>
+      <w:proofErr w:type="spellEnd"/>
+      <w:r>
+        <w:t xml:space="preserve"> + </w:t>
+      </w:r>
+      <w:proofErr w:type="spellStart"/>
+      <w:r>
+        <w:t>snapshot_ts</w:t>
+      </w:r>
+      <w:proofErr w:type="spellEnd"/>
+      <w:r>
+        <w:t xml:space="preserve">) alapján dolgozzanak. Így egy hálózati hiba utáni </w:t>
+      </w:r>
+      <w:proofErr w:type="spellStart"/>
+      <w:r>
+        <w:t>újrafuttatás</w:t>
+      </w:r>
+      <w:proofErr w:type="spellEnd"/>
+      <w:r>
+        <w:t xml:space="preserve"> nem okoz </w:t>
+      </w:r>
+      <w:proofErr w:type="spellStart"/>
+      <w:r>
+        <w:t>duplikációt</w:t>
+      </w:r>
+      <w:proofErr w:type="spellEnd"/>
+      <w:r>
+        <w:t>.</w:t>
       </w:r>
     </w:p>
     <w:p>
@@ -828,7 +1192,31 @@
         </w:numPr>
       </w:pPr>
       <w:r>
-        <w:t>Fizikai és logikai szétválasztás: A nyers adatok teljes egészében kikerültek a relációs adatbázisból a MinIO objektumtárolóba. A PostgreSQL így tehermentesítve, dedikáltan csak a tisztított adattárház és a metaadatok (config séma) tárolásáért felel. Ez a feladatkör</w:t>
+        <w:t xml:space="preserve">Fizikai és logikai szétválasztás: A nyers adatok teljes egészében kikerültek a relációs adatbázisból a </w:t>
+      </w:r>
+      <w:proofErr w:type="spellStart"/>
+      <w:r>
+        <w:t>MinIO</w:t>
+      </w:r>
+      <w:proofErr w:type="spellEnd"/>
+      <w:r>
+        <w:t xml:space="preserve"> objektumtárolóba. A </w:t>
+      </w:r>
+      <w:proofErr w:type="spellStart"/>
+      <w:r>
+        <w:t>PostgreSQL</w:t>
+      </w:r>
+      <w:proofErr w:type="spellEnd"/>
+      <w:r>
+        <w:t xml:space="preserve"> így tehermentesítve, dedikáltan csak a tisztított adattárház és a metaadatok (</w:t>
+      </w:r>
+      <w:proofErr w:type="spellStart"/>
+      <w:r>
+        <w:t>config</w:t>
+      </w:r>
+      <w:proofErr w:type="spellEnd"/>
+      <w:r>
+        <w:t xml:space="preserve"> séma) tárolásáért felel. Ez a feladatkör</w:t>
       </w:r>
       <w:r>
         <w:t xml:space="preserve"> </w:t>
@@ -858,19 +1246,56 @@
         </w:numPr>
       </w:pPr>
       <w:r>
-        <w:t>Zárolásmentes frissítés: A Materialized View frissítése CONCURRENTLY módon történik</w:t>
+        <w:t xml:space="preserve">Zárolásmentes frissítés: A </w:t>
+      </w:r>
+      <w:proofErr w:type="spellStart"/>
+      <w:r>
+        <w:t>Materialized</w:t>
+      </w:r>
+      <w:proofErr w:type="spellEnd"/>
+      <w:r>
+        <w:t xml:space="preserve"> </w:t>
+      </w:r>
+      <w:proofErr w:type="spellStart"/>
+      <w:r>
+        <w:t>View</w:t>
+      </w:r>
+      <w:proofErr w:type="spellEnd"/>
+      <w:r>
+        <w:t xml:space="preserve"> frissítése CONCURRENTLY módon történik</w:t>
       </w:r>
       <w:r>
         <w:t xml:space="preserve"> (</w:t>
       </w:r>
       <w:r>
-        <w:t>hiba esetén sima refresh fallback</w:t>
-      </w:r>
+        <w:t xml:space="preserve">hiba esetén sima </w:t>
+      </w:r>
+      <w:proofErr w:type="spellStart"/>
+      <w:r>
+        <w:t>refresh</w:t>
+      </w:r>
+      <w:proofErr w:type="spellEnd"/>
+      <w:r>
+        <w:t xml:space="preserve"> </w:t>
+      </w:r>
+      <w:proofErr w:type="spellStart"/>
+      <w:r>
+        <w:t>fallback</w:t>
+      </w:r>
+      <w:proofErr w:type="spellEnd"/>
       <w:r>
         <w:t>)</w:t>
       </w:r>
       <w:r>
-        <w:t>, így a dashboardok olvasási m</w:t>
+        <w:t xml:space="preserve">, így a </w:t>
+      </w:r>
+      <w:proofErr w:type="spellStart"/>
+      <w:r>
+        <w:t>dashboardok</w:t>
+      </w:r>
+      <w:proofErr w:type="spellEnd"/>
+      <w:r>
+        <w:t xml:space="preserve"> olvasási m</w:t>
       </w:r>
       <w:r>
         <w:rPr>
@@ -897,7 +1322,23 @@
         <w:t xml:space="preserve"> </w:t>
       </w:r>
       <w:r>
-        <w:t>kezelés: A részvénypiac zárvatartása miatt hétvégén nem érkezik új stock adat. A kiszolgálás ilyenkor az utolsó elérhet</w:t>
+        <w:t xml:space="preserve">kezelés: A részvénypiac </w:t>
+      </w:r>
+      <w:proofErr w:type="spellStart"/>
+      <w:r>
+        <w:t>zárvatartása</w:t>
+      </w:r>
+      <w:proofErr w:type="spellEnd"/>
+      <w:r>
+        <w:t xml:space="preserve"> miatt hétvégén nem érkezik új </w:t>
+      </w:r>
+      <w:proofErr w:type="spellStart"/>
+      <w:r>
+        <w:t>stock</w:t>
+      </w:r>
+      <w:proofErr w:type="spellEnd"/>
+      <w:r>
+        <w:t xml:space="preserve"> adat. A kiszolgálás ilyenkor az utolsó elérhet</w:t>
       </w:r>
       <w:r>
         <w:rPr>
@@ -906,7 +1347,23 @@
         <w:t>ő</w:t>
       </w:r>
       <w:r>
-        <w:t xml:space="preserve">, valós kereskedési snapshotra esik vissza, így a dashboard nem </w:t>
+        <w:t xml:space="preserve">, valós kereskedési </w:t>
+      </w:r>
+      <w:proofErr w:type="spellStart"/>
+      <w:r>
+        <w:t>snapshotra</w:t>
+      </w:r>
+      <w:proofErr w:type="spellEnd"/>
+      <w:r>
+        <w:t xml:space="preserve"> esik vissza, így a </w:t>
+      </w:r>
+      <w:proofErr w:type="spellStart"/>
+      <w:r>
+        <w:t>dashboard</w:t>
+      </w:r>
+      <w:proofErr w:type="spellEnd"/>
+      <w:r>
+        <w:t xml:space="preserve"> nem </w:t>
       </w:r>
       <w:r>
         <w:t>marad üres</w:t>
@@ -921,13 +1378,21 @@
         <w:t>ő</w:t>
       </w:r>
       <w:r>
-        <w:t>bélyeget, nem tol át pénteki adatot szombatra/vasárnapra, kizárólag a ténylegesen beérkezett timestamp</w:t>
+        <w:t xml:space="preserve">bélyeget, nem tol át pénteki adatot szombatra/vasárnapra, kizárólag a ténylegesen beérkezett </w:t>
+      </w:r>
+      <w:proofErr w:type="spellStart"/>
+      <w:r>
+        <w:t>timestamp</w:t>
       </w:r>
       <w:r>
         <w:t>-</w:t>
       </w:r>
       <w:r>
-        <w:t>eket használja.</w:t>
+        <w:t>eket</w:t>
+      </w:r>
+      <w:proofErr w:type="spellEnd"/>
+      <w:r>
+        <w:t xml:space="preserve"> használja.</w:t>
       </w:r>
     </w:p>
     <w:p>
@@ -939,13 +1404,61 @@
         </w:numPr>
       </w:pPr>
       <w:r>
-        <w:t>A vállalati adatoknál SCD Type 2 megközelítést alkalmazok. A config.stock_universe tábla az aktuális állapotot tart</w:t>
+        <w:t xml:space="preserve">A vállalati adatoknál SCD </w:t>
+      </w:r>
+      <w:proofErr w:type="spellStart"/>
+      <w:r>
+        <w:t>Type</w:t>
+      </w:r>
+      <w:proofErr w:type="spellEnd"/>
+      <w:r>
+        <w:t xml:space="preserve"> 2 megközelítést alkalmazok. A </w:t>
+      </w:r>
+      <w:proofErr w:type="spellStart"/>
+      <w:r>
+        <w:t>config.stock_universe</w:t>
+      </w:r>
+      <w:proofErr w:type="spellEnd"/>
+      <w:r>
+        <w:t xml:space="preserve"> tábla az aktuális állapotot tart</w:t>
       </w:r>
       <w:r>
         <w:t xml:space="preserve">almazza </w:t>
       </w:r>
       <w:r>
-        <w:t>a lekérdezésekhez, míg a config.stock_universe_hist tábla teljes verziótörténetet tárol valid_from, valid_to és is_current mez</w:t>
+        <w:t xml:space="preserve">a lekérdezésekhez, míg a </w:t>
+      </w:r>
+      <w:proofErr w:type="spellStart"/>
+      <w:r>
+        <w:t>config.stock_universe_hist</w:t>
+      </w:r>
+      <w:proofErr w:type="spellEnd"/>
+      <w:r>
+        <w:t xml:space="preserve"> tábla teljes verziótörténetet tárol </w:t>
+      </w:r>
+      <w:proofErr w:type="spellStart"/>
+      <w:r>
+        <w:t>valid_from</w:t>
+      </w:r>
+      <w:proofErr w:type="spellEnd"/>
+      <w:r>
+        <w:t xml:space="preserve">, </w:t>
+      </w:r>
+      <w:proofErr w:type="spellStart"/>
+      <w:r>
+        <w:t>valid_to</w:t>
+      </w:r>
+      <w:proofErr w:type="spellEnd"/>
+      <w:r>
+        <w:t xml:space="preserve"> és </w:t>
+      </w:r>
+      <w:proofErr w:type="spellStart"/>
+      <w:r>
+        <w:t>is_current</w:t>
+      </w:r>
+      <w:proofErr w:type="spellEnd"/>
+      <w:r>
+        <w:t xml:space="preserve"> mez</w:t>
       </w:r>
       <w:r>
         <w:rPr>
@@ -954,7 +1467,15 @@
         <w:t>ő</w:t>
       </w:r>
       <w:r>
-        <w:t>kkel. Attribútumváltozás (pl. név, szektor, marketcap, súly) esetén a korábbi rekord lezárásra kerül és új aktuális rekord jön létre, így a múltbeli állapotok is visszakereshet</w:t>
+        <w:t xml:space="preserve">kkel. Attribútumváltozás (pl. név, szektor, </w:t>
+      </w:r>
+      <w:proofErr w:type="spellStart"/>
+      <w:r>
+        <w:t>marketcap</w:t>
+      </w:r>
+      <w:proofErr w:type="spellEnd"/>
+      <w:r>
+        <w:t>, súly) esetén a korábbi rekord lezárásra kerül és új aktuális rekord jön létre, így a múltbeli állapotok is visszakereshet</w:t>
       </w:r>
       <w:r>
         <w:rPr>
@@ -971,7 +1492,15 @@
         <w:pStyle w:val="Cmsor1"/>
       </w:pPr>
       <w:r>
-        <w:t>A pipeline m</w:t>
+        <w:t xml:space="preserve">A </w:t>
+      </w:r>
+      <w:proofErr w:type="spellStart"/>
+      <w:r>
+        <w:t>pipeline</w:t>
+      </w:r>
+      <w:proofErr w:type="spellEnd"/>
+      <w:r>
+        <w:t xml:space="preserve"> m</w:t>
       </w:r>
       <w:r>
         <w:rPr>
@@ -985,7 +1514,15 @@
     </w:p>
     <w:p>
       <w:r>
-        <w:t>A pipeline 5 percenként futtatja a teljes feldolgozási ciklust a nyers adatgy</w:t>
+        <w:t xml:space="preserve">A </w:t>
+      </w:r>
+      <w:proofErr w:type="spellStart"/>
+      <w:r>
+        <w:t>pipeline</w:t>
+      </w:r>
+      <w:proofErr w:type="spellEnd"/>
+      <w:r>
+        <w:t xml:space="preserve"> 5 percenként futtatja a teljes feldolgozási ciklust a nyers adatgy</w:t>
       </w:r>
       <w:r>
         <w:rPr>
@@ -1003,7 +1540,23 @@
         <w:t>ő</w:t>
       </w:r>
       <w:r>
-        <w:t>l a vizualizációig a részvények (kizárólag hétköznapokon) és a kriptovaluták esetében. Az S&amp;P 500 vállalati adatok naponta egyszer, éjfélkor frissülnek a Kaggle platformról (a frissítés id</w:t>
+        <w:t xml:space="preserve">l a vizualizációig a részvények (kizárólag hétköznapokon) és a </w:t>
+      </w:r>
+      <w:proofErr w:type="spellStart"/>
+      <w:r>
+        <w:t>kriptovaluták</w:t>
+      </w:r>
+      <w:proofErr w:type="spellEnd"/>
+      <w:r>
+        <w:t xml:space="preserve"> esetében. Az S&amp;P 500 vállalati adatok naponta egyszer, éjfélkor frissülnek a </w:t>
+      </w:r>
+      <w:proofErr w:type="spellStart"/>
+      <w:r>
+        <w:t>Kaggle</w:t>
+      </w:r>
+      <w:proofErr w:type="spellEnd"/>
+      <w:r>
+        <w:t xml:space="preserve"> platformról (a frissítés id</w:t>
       </w:r>
       <w:r>
         <w:rPr>
@@ -1012,7 +1565,15 @@
         <w:t>ő</w:t>
       </w:r>
       <w:r>
-        <w:t>zítése a dataset készít</w:t>
+        <w:t xml:space="preserve">zítése a </w:t>
+      </w:r>
+      <w:proofErr w:type="spellStart"/>
+      <w:r>
+        <w:t>dataset</w:t>
+      </w:r>
+      <w:proofErr w:type="spellEnd"/>
+      <w:r>
+        <w:t xml:space="preserve"> készít</w:t>
       </w:r>
       <w:r>
         <w:rPr>
@@ -1044,8 +1605,53 @@
           <w:numId w:val="16"/>
         </w:numPr>
       </w:pPr>
-      <w:r>
-        <w:t>Extract: A kriptovaluta adatok a CoinPaprika API-ból, a részvényárfolyamok a yfinance könyvtáron keresztül, az S&amp;P 500 vállalati adatok pedig a Kaggle platformról érkeznek</w:t>
+      <w:proofErr w:type="spellStart"/>
+      <w:r>
+        <w:t>Extract</w:t>
+      </w:r>
+      <w:proofErr w:type="spellEnd"/>
+      <w:r>
+        <w:t xml:space="preserve">: A </w:t>
+      </w:r>
+      <w:proofErr w:type="spellStart"/>
+      <w:r>
+        <w:t>kriptovaluta</w:t>
+      </w:r>
+      <w:proofErr w:type="spellEnd"/>
+      <w:r>
+        <w:t xml:space="preserve"> adatok a </w:t>
+      </w:r>
+      <w:proofErr w:type="spellStart"/>
+      <w:r>
+        <w:t>CoinPaprika</w:t>
+      </w:r>
+      <w:proofErr w:type="spellEnd"/>
+      <w:r>
+        <w:t xml:space="preserve"> API-</w:t>
+      </w:r>
+      <w:proofErr w:type="spellStart"/>
+      <w:r>
+        <w:t>ból</w:t>
+      </w:r>
+      <w:proofErr w:type="spellEnd"/>
+      <w:r>
+        <w:t xml:space="preserve">, a részvényárfolyamok a </w:t>
+      </w:r>
+      <w:proofErr w:type="spellStart"/>
+      <w:r>
+        <w:t>yfinance</w:t>
+      </w:r>
+      <w:proofErr w:type="spellEnd"/>
+      <w:r>
+        <w:t xml:space="preserve"> könyvtáron keresztül, az S&amp;P 500 vállalati adatok pedig a </w:t>
+      </w:r>
+      <w:proofErr w:type="spellStart"/>
+      <w:r>
+        <w:t>Kaggle</w:t>
+      </w:r>
+      <w:proofErr w:type="spellEnd"/>
+      <w:r>
+        <w:t xml:space="preserve"> platformról érkeznek</w:t>
       </w:r>
       <w:r>
         <w:t>.</w:t>
@@ -1059,14 +1665,43 @@
           <w:numId w:val="16"/>
         </w:numPr>
       </w:pPr>
-      <w:r>
-        <w:t>Raw Storage: Az adatok MinIO bucketekbe kerülnek JSON/CSV formátumban</w:t>
+      <w:proofErr w:type="spellStart"/>
+      <w:r>
+        <w:t>Raw</w:t>
+      </w:r>
+      <w:proofErr w:type="spellEnd"/>
+      <w:r>
+        <w:t xml:space="preserve"> Storage: Az adatok </w:t>
+      </w:r>
+      <w:proofErr w:type="spellStart"/>
+      <w:r>
+        <w:t>MinIO</w:t>
+      </w:r>
+      <w:proofErr w:type="spellEnd"/>
+      <w:r>
+        <w:t xml:space="preserve"> </w:t>
+      </w:r>
+      <w:proofErr w:type="spellStart"/>
+      <w:r>
+        <w:t>bucketekbe</w:t>
+      </w:r>
+      <w:proofErr w:type="spellEnd"/>
+      <w:r>
+        <w:t xml:space="preserve"> kerülnek JSON/CSV formátumban</w:t>
       </w:r>
       <w:r>
         <w:t xml:space="preserve">. </w:t>
       </w:r>
       <w:r>
-        <w:t>A bucketeken belüli elrendezés id</w:t>
+        <w:t xml:space="preserve">A </w:t>
+      </w:r>
+      <w:proofErr w:type="spellStart"/>
+      <w:r>
+        <w:t>bucketeken</w:t>
+      </w:r>
+      <w:proofErr w:type="spellEnd"/>
+      <w:r>
+        <w:t xml:space="preserve"> belüli elrendezés id</w:t>
       </w:r>
       <w:r>
         <w:rPr>
@@ -1075,7 +1710,15 @@
         <w:t>ő</w:t>
       </w:r>
       <w:r>
-        <w:t>alapú particionálást követ</w:t>
+        <w:t xml:space="preserve">alapú </w:t>
+      </w:r>
+      <w:proofErr w:type="spellStart"/>
+      <w:r>
+        <w:t>particionálást</w:t>
+      </w:r>
+      <w:proofErr w:type="spellEnd"/>
+      <w:r>
+        <w:t xml:space="preserve"> követ</w:t>
       </w:r>
       <w:r>
         <w:t xml:space="preserve">, </w:t>
@@ -1096,8 +1739,13 @@
         <w:t xml:space="preserve"> esetleges</w:t>
       </w:r>
       <w:r>
-        <w:t xml:space="preserve"> Parquet</w:t>
-      </w:r>
+        <w:t xml:space="preserve"> </w:t>
+      </w:r>
+      <w:proofErr w:type="spellStart"/>
+      <w:r>
+        <w:t>Parquet</w:t>
+      </w:r>
+      <w:proofErr w:type="spellEnd"/>
       <w:r>
         <w:t xml:space="preserve"> </w:t>
       </w:r>
@@ -1131,8 +1779,21 @@
           <w:numId w:val="16"/>
         </w:numPr>
       </w:pPr>
-      <w:r>
-        <w:t>Transform: A Pandas elvégzi a típuskonverziókat, a NULL értékek kezelését és az id</w:t>
+      <w:proofErr w:type="spellStart"/>
+      <w:r>
+        <w:t>Transform</w:t>
+      </w:r>
+      <w:proofErr w:type="spellEnd"/>
+      <w:r>
+        <w:t xml:space="preserve">: A </w:t>
+      </w:r>
+      <w:proofErr w:type="spellStart"/>
+      <w:r>
+        <w:t>Pandas</w:t>
+      </w:r>
+      <w:proofErr w:type="spellEnd"/>
+      <w:r>
+        <w:t xml:space="preserve"> elvégzi a típuskonverziókat, a NULL értékek kezelését és az id</w:t>
       </w:r>
       <w:r>
         <w:rPr>
@@ -1156,7 +1817,47 @@
         <w:t>ű</w:t>
       </w:r>
       <w:r>
-        <w:t xml:space="preserve"> aggregáció is készül (company_count, avg_marketcap, total_weight), amely a config.sector_stats táblába kerül.</w:t>
+        <w:t xml:space="preserve"> </w:t>
+      </w:r>
+      <w:proofErr w:type="spellStart"/>
+      <w:r>
+        <w:t>aggregáció</w:t>
+      </w:r>
+      <w:proofErr w:type="spellEnd"/>
+      <w:r>
+        <w:t xml:space="preserve"> is készül (</w:t>
+      </w:r>
+      <w:proofErr w:type="spellStart"/>
+      <w:r>
+        <w:t>company_count</w:t>
+      </w:r>
+      <w:proofErr w:type="spellEnd"/>
+      <w:r>
+        <w:t xml:space="preserve">, </w:t>
+      </w:r>
+      <w:proofErr w:type="spellStart"/>
+      <w:r>
+        <w:t>avg_marketcap</w:t>
+      </w:r>
+      <w:proofErr w:type="spellEnd"/>
+      <w:r>
+        <w:t xml:space="preserve">, </w:t>
+      </w:r>
+      <w:proofErr w:type="spellStart"/>
+      <w:r>
+        <w:t>total_weight</w:t>
+      </w:r>
+      <w:proofErr w:type="spellEnd"/>
+      <w:r>
+        <w:t xml:space="preserve">), amely a </w:t>
+      </w:r>
+      <w:proofErr w:type="spellStart"/>
+      <w:r>
+        <w:t>config.sector_stats</w:t>
+      </w:r>
+      <w:proofErr w:type="spellEnd"/>
+      <w:r>
+        <w:t xml:space="preserve"> táblába kerül.</w:t>
       </w:r>
     </w:p>
     <w:p>
@@ -1167,14 +1868,56 @@
           <w:numId w:val="16"/>
         </w:numPr>
       </w:pPr>
-      <w:r>
-        <w:t>Load: Az adatok bekerülnek a Postgres DWH</w:t>
+      <w:proofErr w:type="spellStart"/>
+      <w:r>
+        <w:t>Load</w:t>
+      </w:r>
+      <w:proofErr w:type="spellEnd"/>
+      <w:r>
+        <w:t xml:space="preserve">: Az adatok bekerülnek a </w:t>
+      </w:r>
+      <w:proofErr w:type="spellStart"/>
+      <w:r>
+        <w:t>Postgres</w:t>
+      </w:r>
+      <w:proofErr w:type="spellEnd"/>
+      <w:r>
+        <w:t xml:space="preserve"> DWH</w:t>
       </w:r>
       <w:r>
         <w:t>-</w:t>
       </w:r>
-      <w:r>
-        <w:t>ba, majd a Materialized View és a Redis cache frissül.</w:t>
+      <w:proofErr w:type="spellStart"/>
+      <w:r>
+        <w:t>ba</w:t>
+      </w:r>
+      <w:proofErr w:type="spellEnd"/>
+      <w:r>
+        <w:t xml:space="preserve">, majd a </w:t>
+      </w:r>
+      <w:proofErr w:type="spellStart"/>
+      <w:r>
+        <w:t>Materialized</w:t>
+      </w:r>
+      <w:proofErr w:type="spellEnd"/>
+      <w:r>
+        <w:t xml:space="preserve"> </w:t>
+      </w:r>
+      <w:proofErr w:type="spellStart"/>
+      <w:r>
+        <w:t>View</w:t>
+      </w:r>
+      <w:proofErr w:type="spellEnd"/>
+      <w:r>
+        <w:t xml:space="preserve"> és a </w:t>
+      </w:r>
+      <w:proofErr w:type="spellStart"/>
+      <w:r>
+        <w:t>Redis</w:t>
+      </w:r>
+      <w:proofErr w:type="spellEnd"/>
+      <w:r>
+        <w:t xml:space="preserve"> cache frissül.</w:t>
       </w:r>
     </w:p>
     <w:p>
@@ -1187,7 +1930,15 @@
     </w:p>
     <w:p>
       <w:r>
-        <w:t>A rendszer négy dashboard nézetet használ:</w:t>
+        <w:t xml:space="preserve">A rendszer négy </w:t>
+      </w:r>
+      <w:proofErr w:type="spellStart"/>
+      <w:r>
+        <w:t>dashboard</w:t>
+      </w:r>
+      <w:proofErr w:type="spellEnd"/>
+      <w:r>
+        <w:t xml:space="preserve"> nézetet használ:</w:t>
       </w:r>
     </w:p>
     <w:p>
@@ -1199,7 +1950,39 @@
         </w:numPr>
       </w:pPr>
       <w:r>
-        <w:t>Market Movers &amp; Momentum: 24 órás változások, scatter plotok a return/volumen kapcsolatáról és a Top 10 eszköz listája.</w:t>
+        <w:t xml:space="preserve">Market </w:t>
+      </w:r>
+      <w:proofErr w:type="spellStart"/>
+      <w:r>
+        <w:t>Movers</w:t>
+      </w:r>
+      <w:proofErr w:type="spellEnd"/>
+      <w:r>
+        <w:t xml:space="preserve"> &amp; Momentum: 24 órás változások, </w:t>
+      </w:r>
+      <w:proofErr w:type="spellStart"/>
+      <w:r>
+        <w:t>scatter</w:t>
+      </w:r>
+      <w:proofErr w:type="spellEnd"/>
+      <w:r>
+        <w:t xml:space="preserve"> </w:t>
+      </w:r>
+      <w:proofErr w:type="spellStart"/>
+      <w:r>
+        <w:t>plotok</w:t>
+      </w:r>
+      <w:proofErr w:type="spellEnd"/>
+      <w:r>
+        <w:t xml:space="preserve"> a </w:t>
+      </w:r>
+      <w:proofErr w:type="spellStart"/>
+      <w:r>
+        <w:t>return</w:t>
+      </w:r>
+      <w:proofErr w:type="spellEnd"/>
+      <w:r>
+        <w:t>/volumen kapcsolatáról és a Top 10 eszköz listája.</w:t>
       </w:r>
     </w:p>
     <w:p>
@@ -1211,7 +1994,15 @@
         </w:numPr>
       </w:pPr>
       <w:r>
-        <w:t>Market Overview: Részletes id</w:t>
+        <w:t xml:space="preserve">Market </w:t>
+      </w:r>
+      <w:proofErr w:type="spellStart"/>
+      <w:r>
+        <w:t>Overview</w:t>
+      </w:r>
+      <w:proofErr w:type="spellEnd"/>
+      <w:r>
+        <w:t>: Részletes id</w:t>
       </w:r>
       <w:r>
         <w:rPr>
@@ -1220,8 +2011,13 @@
         <w:t>ő</w:t>
       </w:r>
       <w:r>
-        <w:t>soros elemzés Bollinger</w:t>
-      </w:r>
+        <w:t xml:space="preserve">soros elemzés </w:t>
+      </w:r>
+      <w:proofErr w:type="spellStart"/>
+      <w:r>
+        <w:t>Bollinger</w:t>
+      </w:r>
+      <w:proofErr w:type="spellEnd"/>
       <w:r>
         <w:t xml:space="preserve"> </w:t>
       </w:r>
@@ -1238,7 +2034,23 @@
         </w:numPr>
       </w:pPr>
       <w:r>
-        <w:t xml:space="preserve">Market Analytics Overview: </w:t>
+        <w:t xml:space="preserve">Market </w:t>
+      </w:r>
+      <w:proofErr w:type="spellStart"/>
+      <w:r>
+        <w:t>Analytics</w:t>
+      </w:r>
+      <w:proofErr w:type="spellEnd"/>
+      <w:r>
+        <w:t xml:space="preserve"> </w:t>
+      </w:r>
+      <w:proofErr w:type="spellStart"/>
+      <w:r>
+        <w:t>Overview</w:t>
+      </w:r>
+      <w:proofErr w:type="spellEnd"/>
+      <w:r>
+        <w:t xml:space="preserve">: </w:t>
       </w:r>
       <w:r>
         <w:t>eszköz</w:t>
@@ -1259,7 +2071,15 @@
         <w:t xml:space="preserve"> (drilldown lehetőséggel az eszköz szimbólumára nyomva)</w:t>
       </w:r>
       <w:r>
-        <w:t>, valamint SP500 szektor aggregáció.</w:t>
+        <w:t xml:space="preserve">, valamint SP500 szektor </w:t>
+      </w:r>
+      <w:proofErr w:type="spellStart"/>
+      <w:r>
+        <w:t>aggregáció</w:t>
+      </w:r>
+      <w:proofErr w:type="spellEnd"/>
+      <w:r>
+        <w:t>.</w:t>
       </w:r>
     </w:p>
     <w:p>
@@ -1270,8 +2090,21 @@
           <w:numId w:val="17"/>
         </w:numPr>
       </w:pPr>
-      <w:r>
-        <w:t>Asset Drilldown Detail:</w:t>
+      <w:proofErr w:type="spellStart"/>
+      <w:r>
+        <w:t>Asset</w:t>
+      </w:r>
+      <w:proofErr w:type="spellEnd"/>
+      <w:r>
+        <w:t xml:space="preserve"> Drilldown </w:t>
+      </w:r>
+      <w:proofErr w:type="spellStart"/>
+      <w:r>
+        <w:t>Detail</w:t>
+      </w:r>
+      <w:proofErr w:type="spellEnd"/>
+      <w:r>
+        <w:t>:</w:t>
       </w:r>
       <w:r>
         <w:t xml:space="preserve"> lefúrás</w:t>
@@ -1280,8 +2113,13 @@
         <w:t xml:space="preserve"> után megjelenő</w:t>
       </w:r>
       <w:r>
-        <w:t xml:space="preserve"> dashboard</w:t>
-      </w:r>
+        <w:t xml:space="preserve"> </w:t>
+      </w:r>
+      <w:proofErr w:type="spellStart"/>
+      <w:r>
+        <w:t>dashboard</w:t>
+      </w:r>
+      <w:proofErr w:type="spellEnd"/>
       <w:r>
         <w:t>,</w:t>
       </w:r>
@@ -1296,11 +2134,16 @@
       <w:pPr>
         <w:pStyle w:val="Cmsor1"/>
       </w:pPr>
+      <w:proofErr w:type="spellStart"/>
       <w:r>
         <w:t>P</w:t>
       </w:r>
       <w:r>
-        <w:t>ipeline futásának eredményé</w:t>
+        <w:t>ipeline</w:t>
+      </w:r>
+      <w:proofErr w:type="spellEnd"/>
+      <w:r>
+        <w:t xml:space="preserve"> futásának eredményé</w:t>
       </w:r>
       <w:r>
         <w:t>t igazoló grafikonok</w:t>
@@ -1388,11 +2231,29 @@
         <w:fldChar w:fldCharType="end"/>
       </w:r>
       <w:r>
-        <w:t xml:space="preserve">. ábra Kriptó Top Movers és </w:t>
-      </w:r>
+        <w:t xml:space="preserve">. ábra </w:t>
+      </w:r>
+      <w:proofErr w:type="spellStart"/>
+      <w:r>
+        <w:t>Kriptó</w:t>
+      </w:r>
+      <w:proofErr w:type="spellEnd"/>
+      <w:r>
+        <w:t xml:space="preserve"> Top </w:t>
+      </w:r>
+      <w:proofErr w:type="spellStart"/>
+      <w:r>
+        <w:t>Movers</w:t>
+      </w:r>
+      <w:proofErr w:type="spellEnd"/>
+      <w:r>
+        <w:t xml:space="preserve"> és </w:t>
+      </w:r>
+      <w:proofErr w:type="spellStart"/>
       <w:r>
         <w:t>Liquidity</w:t>
       </w:r>
+      <w:proofErr w:type="spellEnd"/>
       <w:r>
         <w:t>-</w:t>
       </w:r>
@@ -1479,7 +2340,15 @@
         <w:t xml:space="preserve">. ábra </w:t>
       </w:r>
       <w:r>
-        <w:t>Top kriptovaluták megoszlása forgalom alapján (24h)</w:t>
+        <w:t xml:space="preserve">Top </w:t>
+      </w:r>
+      <w:proofErr w:type="spellStart"/>
+      <w:r>
+        <w:t>kriptovaluták</w:t>
+      </w:r>
+      <w:proofErr w:type="spellEnd"/>
+      <w:r>
+        <w:t xml:space="preserve"> megoszlása forgalom alapján (24h)</w:t>
       </w:r>
     </w:p>
     <w:p>
@@ -1653,10 +2522,23 @@
         <w:fldChar w:fldCharType="end"/>
       </w:r>
       <w:r>
-        <w:t>. ábra Bitcoin</w:t>
-      </w:r>
-      <w:r>
-        <w:t xml:space="preserve"> árfolyam trenddel és volatilitási sávokkal (MA10, Bollinger-sávok)</w:t>
+        <w:t xml:space="preserve">. ábra </w:t>
+      </w:r>
+      <w:proofErr w:type="spellStart"/>
+      <w:r>
+        <w:t>Bitcoin</w:t>
+      </w:r>
+      <w:proofErr w:type="spellEnd"/>
+      <w:r>
+        <w:t xml:space="preserve"> árfolyam trenddel és volatilitási sávokkal (MA10, </w:t>
+      </w:r>
+      <w:proofErr w:type="spellStart"/>
+      <w:r>
+        <w:t>Bollinger</w:t>
+      </w:r>
+      <w:proofErr w:type="spellEnd"/>
+      <w:r>
+        <w:t>-sávok)</w:t>
       </w:r>
     </w:p>
     <w:p>
@@ -4392,6 +5274,7 @@
   <w:style w:type="character" w:default="1" w:styleId="Bekezdsalapbettpusa">
     <w:name w:val="Default Paragraph Font"/>
     <w:uiPriority w:val="1"/>
+    <w:semiHidden/>
     <w:unhideWhenUsed/>
   </w:style>
   <w:style w:type="table" w:default="1" w:styleId="Normltblzat">

</xml_diff>